<commit_message>
Embed financial dashboard chart in Word opening statement
https://claude.ai/code/session_0193uoLEbZXAoMPj83pkMGrN
</commit_message>
<xml_diff>
--- a/meridian_board_opening_statement.docx
+++ b/meridian_board_opening_statement.docx
@@ -1218,6 +1218,74 @@
           <w:sz w:val="18"/>
         </w:rPr>
         <w:t>Read: Revenue growth decelerates every year as margins expand. The business is more profitable and slower-growing simultaneously — a pattern that demands a deliberate strategic answer in 2026.</w:t>
+      </w:r>
+    </w:p>
+    <w:p>
+      <w:pPr>
+        <w:spacing w:before="280" w:after="40"/>
+      </w:pPr>
+      <w:r>
+        <w:rPr>
+          <w:rFonts w:ascii="Calibri" w:hAnsi="Calibri"/>
+          <w:b/>
+          <w:color w:val="0D2B55"/>
+          <w:sz w:val="17"/>
+        </w:rPr>
+        <w:t>FINANCIAL DASHBOARD — FIVE-PANEL SUMMARY</w:t>
+      </w:r>
+    </w:p>
+    <w:p>
+      <w:pPr>
+        <w:spacing w:before="120" w:after="80"/>
+      </w:pPr>
+      <w:r>
+        <w:rPr>
+          <w:rFonts w:ascii="Calibri" w:hAnsi="Calibri"/>
+          <w:i/>
+          <w:color w:val="44546E"/>
+          <w:sz w:val="18"/>
+        </w:rPr>
+        <w:t>The chart below consolidates the key financial trends across revenue growth, margin expansion, segment mix, net revenue retention, and AI Copilot ramp. Detailed exhibits follow in the body of this statement.</w:t>
+      </w:r>
+    </w:p>
+    <w:p>
+      <w:pPr>
+        <w:spacing w:before="80" w:after="240"/>
+        <w:jc w:val="center"/>
+      </w:pPr>
+      <w:r>
+        <w:drawing>
+          <wp:inline xmlns:a="http://schemas.openxmlformats.org/drawingml/2006/main" xmlns:pic="http://schemas.openxmlformats.org/drawingml/2006/picture">
+            <wp:extent cx="5669280" cy="3523713"/>
+            <wp:docPr id="1" name="Picture 1"/>
+            <wp:cNvGraphicFramePr>
+              <a:graphicFrameLocks noChangeAspect="1"/>
+            </wp:cNvGraphicFramePr>
+            <a:graphic>
+              <a:graphicData uri="http://schemas.openxmlformats.org/drawingml/2006/picture">
+                <pic:pic>
+                  <pic:nvPicPr>
+                    <pic:cNvPr id="0" name="meridian_board_chart.png"/>
+                    <pic:cNvPicPr/>
+                  </pic:nvPicPr>
+                  <pic:blipFill>
+                    <a:blip r:embed="rId9"/>
+                    <a:stretch>
+                      <a:fillRect/>
+                    </a:stretch>
+                  </pic:blipFill>
+                  <pic:spPr>
+                    <a:xfrm>
+                      <a:off x="0" y="0"/>
+                      <a:ext cx="5669280" cy="3523713"/>
+                    </a:xfrm>
+                    <a:prstGeom prst="rect"/>
+                  </pic:spPr>
+                </pic:pic>
+              </a:graphicData>
+            </a:graphic>
+          </wp:inline>
+        </w:drawing>
       </w:r>
     </w:p>
     <w:p>

</xml_diff>